<commit_message>
Remove assignments and add FinPay statement
Delete many assignment-related artifacts (docx, md, extracted txt files, images, helper scripts, projects_paths and an archive), plus linkpreviewer SKILL and its screenshot script, and several UI images. Add FinPay_Statement_2026-04-13.pdf and update su92-bscsm-f23-353_MuhammadAlber_Webapp.docx. This cleans up old assignment/QA resources while introducing the new FinPay statement PDF and a revised Webapp document.
</commit_message>
<xml_diff>
--- a/su92-bscsm-f23-353_MuhammadAlber_Webapp.docx
+++ b/su92-bscsm-f23-353_MuhammadAlber_Webapp.docx
@@ -267,19 +267,7 @@
                 <w:rPr>
                   <w:rStyle w:val="Hyperlink"/>
                 </w:rPr>
-                <w:t>https://fintech-lilac.vercel.</w:t>
-              </w:r>
-              <w:r>
-                <w:rPr>
-                  <w:rStyle w:val="Hyperlink"/>
-                </w:rPr>
-                <w:t>a</w:t>
-              </w:r>
-              <w:r>
-                <w:rPr>
-                  <w:rStyle w:val="Hyperlink"/>
-                </w:rPr>
-                <w:t>pp/</w:t>
+                <w:t>https://fintech-lilac.vercel.app/</w:t>
               </w:r>
             </w:hyperlink>
           </w:p>
@@ -984,6 +972,9 @@
         <w:pStyle w:val="BodyText"/>
       </w:pPr>
       <w:r>
+        <w:rPr>
+          <w:noProof/>
+        </w:rPr>
         <w:drawing>
           <wp:inline distT="0" distB="0" distL="0" distR="0" wp14:anchorId="7E88FC17" wp14:editId="7A869147">
             <wp:extent cx="5943600" cy="3438525"/>
@@ -1031,6 +1022,9 @@
         <w:pStyle w:val="BodyText"/>
       </w:pPr>
       <w:r>
+        <w:rPr>
+          <w:noProof/>
+        </w:rPr>
         <w:drawing>
           <wp:inline distT="0" distB="0" distL="0" distR="0" wp14:anchorId="5AEA2041" wp14:editId="46EF299A">
             <wp:extent cx="5943600" cy="2923540"/>
@@ -1090,6 +1084,9 @@
       <w:bookmarkStart w:id="14" w:name="c.-account-restriction-frozen-state"/>
       <w:bookmarkEnd w:id="13"/>
       <w:r>
+        <w:rPr>
+          <w:noProof/>
+        </w:rPr>
         <w:drawing>
           <wp:inline distT="0" distB="0" distL="0" distR="0" wp14:anchorId="4E6CBC4A" wp14:editId="3BD0D081">
             <wp:extent cx="5943600" cy="3276600"/>
@@ -1143,6 +1140,7 @@
         <w:rPr>
           <w:i/>
           <w:iCs/>
+          <w:noProof/>
         </w:rPr>
         <w:drawing>
           <wp:inline distT="0" distB="0" distL="0" distR="0" wp14:anchorId="59CAE1AC" wp14:editId="23B1AE88">
@@ -1204,6 +1202,9 @@
         <w:pStyle w:val="FirstParagraph"/>
       </w:pPr>
       <w:r>
+        <w:rPr>
+          <w:noProof/>
+        </w:rPr>
         <w:drawing>
           <wp:inline distT="0" distB="0" distL="0" distR="0" wp14:anchorId="099A3544" wp14:editId="00525C84">
             <wp:extent cx="5943600" cy="3192780"/>
@@ -1240,28 +1241,8 @@
           </wp:inline>
         </w:drawing>
       </w:r>
-    </w:p>
-    <w:p>
-      <w:pPr>
-        <w:pStyle w:val="Heading3"/>
-      </w:pPr>
       <w:bookmarkStart w:id="16" w:name="e.-mobile-app-native-interface"/>
       <w:bookmarkEnd w:id="15"/>
-      <w:r>
-        <w:t>E. Mobile App (Native Interface)</w:t>
-      </w:r>
-    </w:p>
-    <w:p>
-      <w:pPr>
-        <w:pStyle w:val="FirstParagraph"/>
-      </w:pPr>
-      <w:r>
-        <w:rPr>
-          <w:i/>
-          <w:iCs/>
-        </w:rPr>
-        <w:t>(Insert screenshot of the FinPay mobile app running on a device)</w:t>
-      </w:r>
     </w:p>
     <w:p>
       <w:r>

</xml_diff>